<commit_message>
Print the PDF at the published type size: 10pt body, 9pt code, 8pt footer
The OASIS Markdown stylesheet sets screen sizes only (12pt body, 12pt tables,
18pt h1). Headless Chrome prints CSS points one to one, so both rendered PDFs
came out at 12pt body text against 10pt in the published DMLex PDF, with a 6pt
footer against 8pt. tools/publication-assurance/print.css now pins a print type
scale in points, applied by print_pdf.mjs after the OASIS stylesheet and the
PDF preprocessor, and keeps headings and example captions with what follows
them. The v1.0 OS edition goes from 228 pages to 194 (published: 218).

The 24 September reports measured median word-box height, which includes
line spacing, and scored 12pt text as a match for 10pt. The audit record gains
finding F10 and the corrected measurement; the rendering comparison, the
landing page, both rendered PDFs and the five PDF side-by-side pictures are
regenerated from the new render.
</commit_message>
<xml_diff>
--- a/tools/publication-assurance/reports/2026-09-24/dmlex-markdown-edition-publication-audit-2026-09-24.docx
+++ b/tools/publication-assurance/reports/2026-09-24/dmlex-markdown-edition-publication-audit-2026-09-24.docx
@@ -1054,7 +1054,7 @@
                 <w:color w:val="1E293B"/>
                 <w:sz w:val="18"/>
               </w:rPr>
-              <w:t>Precedent is the published DMLex v1.0 OS in its own DocBook render. verify_md.py against the live HTML: RESULT PASS; 0 unexplained difference regions; 311 of 311 numbered headings; 316 of 316 code blocks identical; 3,166 internal links, 0 broken; 50 of 50 images present. Rendered through the OASIS Markdown pipeline, the edition takes the OASIS Markdown template look (markdown-styles v1.7.3 stylesheet) with the published content. Two render defects were found in this audit and fixed before release (F1, F2): figure width and PDF scale. After the fixes, body text prints at a median word height of 13.4pt against 13.6pt in the published PDF, figures at 567px against 566.9px, and the PDF carries the published footer layout. Accepted class differences: the Markdown template labels the cover URIs This/Previous/Latest stage rather than version, notes render as shaded blocks, and the table of contents is a nested list with object-type names in body type rather than monospace. The Appendix D UML diagram is regenerated from the TC's own source by the converter, so Graphviz places the boxes differently from the published SVG while the classes, attributes and relations are the same.</w:t>
+              <w:t>Precedent is the published DMLex v1.0 OS in its own DocBook render. verify_md.py against the live HTML: RESULT PASS; 0 unexplained difference regions; 311 of 311 numbered headings; 316 of 316 code blocks identical; 3,166 internal links, 0 broken; 50 of 50 images present. Rendered through the OASIS Markdown pipeline, the edition takes the OASIS Markdown template look (markdown-styles v1.7.3 stylesheet) with the published content. Two render defects were found in this audit and fixed before release (F1, F2): figure width and PDF scale. After the fixes, body text prints at 10pt and code at 9pt against 10pt and 10pt in the published PDF (font sizes read from the PDF text layer, corrected 25 September, see F10), figures at 567px against 566.9px, and the PDF carries the published footer layout at the published 8pt. Accepted class differences: the Markdown template labels the cover URIs This/Previous/Latest stage rather than version, notes render as shaded blocks, and the table of contents is a nested list with object-type names in body type rather than monospace. The Appendix D UML diagram is regenerated from the TC's own source by the converter, so Graphviz places the boxes differently from the published SVG while the classes, attributes and relations are the same.</w:t>
             </w:r>
           </w:p>
         </w:tc>
@@ -2466,7 +2466,7 @@
           <w:rFonts w:ascii="Arial" w:hAnsi="Arial"/>
           <w:sz w:val="20"/>
         </w:rPr>
-        <w:t xml:space="preserve"> Median body word height 13.41pt (published 13.61pt); text spans the full 20mm-margin column (57pt to 539pt); footer present on every page; pdf-cover raises nothing.</w:t>
+        <w:t xml:space="preserve"> Text spans the full 20mm-margin column (57pt to 539pt); footer present on every page; pdf-cover raises nothing. The body size first reported here (median word height 13.41pt against 13.61pt) measured word boxes, not type size, and hid a 12pt against 10pt mismatch: see F10.</w:t>
       </w:r>
     </w:p>
     <w:p>
@@ -2787,6 +2787,86 @@
     </w:p>
     <w:p>
       <w:pPr>
+        <w:pStyle w:val="Heading3"/>
+      </w:pPr>
+      <w:r>
+        <w:t>F10 (product, major, REMEDIATED): PDF body text printed at 12pt against the published 10pt (fixed 25 September)</w:t>
+      </w:r>
+    </w:p>
+    <w:p>
+      <w:pPr>
+        <w:spacing w:after="80"/>
+      </w:pPr>
+      <w:r>
+        <w:rPr>
+          <w:rFonts w:ascii="Arial" w:hAnsi="Arial"/>
+          <w:sz w:val="20"/>
+        </w:rPr>
+        <w:t>The OASIS Markdown stylesheet (markdown-styles v1.7.3) sets 12pt body text, 12pt tables and an 18pt h1, and nothing in the pipeline sets a print size. Headless Chrome prints CSS points one to one, so once the F2 scaling was removed the PDF printed at 12pt against 10pt in the published DMLex PDF, and the footer at 6pt against 8pt. The F2 check compared median word-box heights, which include line spacing, so it scored the two as equal. tools/publication-assurance/print.css now pins a print type scale in points (body 10pt, code 9pt, tables 9pt, headings 16/14/12/11/10pt), applied by print_pdf.mjs after the OASIS stylesheet and preprocessor; the footer is 8pt. The same file keeps headings and example captions on the page with what follows them.</w:t>
+      </w:r>
+    </w:p>
+    <w:p>
+      <w:pPr>
+        <w:spacing w:after="80"/>
+      </w:pPr>
+      <w:r>
+        <w:rPr>
+          <w:rFonts w:ascii="Arial" w:hAnsi="Arial"/>
+          <w:b/>
+          <w:sz w:val="20"/>
+        </w:rPr>
+        <w:t>Impact:</w:t>
+      </w:r>
+      <w:r>
+        <w:rPr>
+          <w:rFonts w:ascii="Arial" w:hAnsi="Arial"/>
+          <w:sz w:val="20"/>
+        </w:rPr>
+        <w:t xml:space="preserve"> Every page of both rendered PDFs, 228 pages for 218 published. The same stylesheet prints at about 8pt under wkhtmltopdf, so the PDF size of any Markdown-track specification depends on the renderer.</w:t>
+      </w:r>
+    </w:p>
+    <w:p>
+      <w:pPr>
+        <w:spacing w:after="80"/>
+      </w:pPr>
+      <w:r>
+        <w:rPr>
+          <w:rFonts w:ascii="Arial" w:hAnsi="Arial"/>
+          <w:b/>
+          <w:sz w:val="20"/>
+        </w:rPr>
+        <w:t>Exposure window:</w:t>
+      </w:r>
+      <w:r>
+        <w:rPr>
+          <w:rFonts w:ascii="Arial" w:hAnsi="Arial"/>
+          <w:sz w:val="20"/>
+        </w:rPr>
+        <w:t xml:space="preserve"> 24 to 25 September 2026: the two rendered PDFs in reports/2026-09-24/rendered on the markdown-conversion branch of the fork. Nothing was published to docs.oasis-open.org.</w:t>
+      </w:r>
+    </w:p>
+    <w:p>
+      <w:pPr>
+        <w:spacing w:after="80"/>
+      </w:pPr>
+      <w:r>
+        <w:rPr>
+          <w:rFonts w:ascii="Arial" w:hAnsi="Arial"/>
+          <w:b/>
+          <w:sz w:val="20"/>
+        </w:rPr>
+        <w:t>Remediation, verified:</w:t>
+      </w:r>
+      <w:r>
+        <w:rPr>
+          <w:rFonts w:ascii="Arial" w:hAnsi="Arial"/>
+          <w:sz w:val="20"/>
+        </w:rPr>
+        <w:t xml:space="preserve"> Font sizes from the PDF text layer (PyMuPDF spans, share of characters): v1.0 OS body LiberationSans 10.0pt 41.0%, code CourierNew 9.0pt 37.8%, footer 8.0pt; published body ArialMT 10.0pt 43.3%, code Courier 10.0pt 35.8%, footer 8.0pt. 194 pages for v1.0 OS and v1.1 WD01 alike. An independent visual review of the new render found no blockers; its two findings, a heading left alone above the Appendix D diagram and a code block split from its caption, were fixed by keeping headings and example captions with what follows them, and a scan of both PDFs finds no page that ends on a heading or an example caption.</w:t>
+      </w:r>
+    </w:p>
+    <w:p>
+      <w:pPr>
         <w:pStyle w:val="Heading2"/>
       </w:pPr>
       <w:r>
@@ -2821,14 +2901,16 @@
   <w:p>
     <w:pPr>
       <w:pStyle w:val="Footer"/>
-      <w:spacing w:before="0" w:after="0"/>
       <w:pBdr>
         <w:top w:val="single" w:sz="2" w:space="1" w:color="94A3B8"/>
       </w:pBdr>
       <w:tabs>
+        <w:tab w:val="clear" w:pos="4680"/>
+        <w:tab w:val="clear" w:pos="9360"/>
         <w:tab w:val="center" w:pos="4819"/>
         <w:tab w:val="right" w:pos="9638"/>
       </w:tabs>
+      <w:spacing w:before="0" w:after="0"/>
     </w:pPr>
     <w:r/>
     <w:r>

</xml_diff>

<commit_message>
DMLex audit: verdict signed off by Michael Coletta, 25 September 2026
</commit_message>
<xml_diff>
--- a/tools/publication-assurance/reports/2026-09-24/dmlex-markdown-edition-publication-audit-2026-09-24.docx
+++ b/tools/publication-assurance/reports/2026-09-24/dmlex-markdown-edition-publication-audit-2026-09-24.docx
@@ -588,10 +588,10 @@
         <w:rPr>
           <w:rFonts w:ascii="Arial" w:hAnsi="Arial"/>
           <w:b/>
-          <w:color w:val="B94A0D"/>
-          <w:sz w:val="20"/>
-        </w:rPr>
-        <w:t>PENDING SIGN-OFF by Michael Coletta, Technical Advisor, OASIS Open.</w:t>
+          <w:color w:val="15803D"/>
+          <w:sz w:val="20"/>
+        </w:rPr>
+        <w:t>Verdict signed off by Michael Coletta, Technical Advisor, OASIS Open, 25 September 2026.</w:t>
       </w:r>
     </w:p>
     <w:p>
@@ -5061,10 +5061,10 @@
         <w:rPr>
           <w:rFonts w:ascii="Arial" w:hAnsi="Arial"/>
           <w:b/>
-          <w:color w:val="B94A0D"/>
-          <w:sz w:val="20"/>
-        </w:rPr>
-        <w:t>PENDING SIGN-OFF by Michael Coletta, Technical Advisor, OASIS Open.</w:t>
+          <w:color w:val="15803D"/>
+          <w:sz w:val="20"/>
+        </w:rPr>
+        <w:t>Verdict signed off by Michael Coletta, Technical Advisor, OASIS Open, 25 September 2026.</w:t>
       </w:r>
     </w:p>
     <w:p>

</xml_diff>